<commit_message>
Bold the headings in the revised Word thesis
Applies bold to the 30 heading paragraphs (要旨, 目次, chapters 1-6,
sections 3.1-3.4 and 4.1-4.3, country sub-headings, references,
appendix and role table). Table-of-contents lines and captions are
left as they were.

Co-Authored-By: Claude Opus 5.5 <noreply@anthropic.com>
Claude-Session: https://claude.ai/code/session_01FFSCEfHqq6dTPt6SnQgTAK
</commit_message>
<xml_diff>
--- a/thesis/卒業論文_修正反映版.docx
+++ b/thesis/卒業論文_修正反映版.docx
@@ -104,6 +104,8 @@
       <w:r>
         <w:rPr>
           <w:rFonts w:ascii="Yu Mincho" w:hAnsi="Yu Mincho" w:eastAsia="Yu Mincho" w:cs="Yu Mincho"/>
+          <w:b/>
+          <w:bCs/>
           <w:szCs w:val="21"/>
         </w:rPr>
         <w:t>要旨</w:t>
@@ -204,6 +206,8 @@
       </w:pPr>
       <w:r>
         <w:rPr>
+          <w:b/>
+          <w:bCs/>
           <w:sz w:val="48"/>
           <w:szCs w:val="48"/>
         </w:rPr>
@@ -385,6 +389,10 @@
     </w:p>
     <w:p>
       <w:r>
+        <w:rPr>
+          <w:b/>
+          <w:bCs/>
+        </w:rPr>
         <w:t xml:space="preserve">1章　はじめに</w:t>
       </w:r>
     </w:p>
@@ -465,6 +473,8 @@
       <w:r>
         <w:rPr>
           <w:rFonts w:ascii="Yu Mincho" w:hAnsi="Yu Mincho" w:eastAsia="Yu Mincho" w:cs="Yu Mincho"/>
+          <w:b/>
+          <w:bCs/>
           <w:color w:val="1F1F1F"/>
           <w:szCs w:val="21"/>
         </w:rPr>
@@ -2732,11 +2742,19 @@
     <w:p/>
     <w:p>
       <w:r>
+        <w:rPr>
+          <w:b/>
+          <w:bCs/>
+        </w:rPr>
         <w:t xml:space="preserve">3章　現状分析</w:t>
       </w:r>
     </w:p>
     <w:p>
       <w:r>
+        <w:rPr>
+          <w:b/>
+          <w:bCs/>
+        </w:rPr>
         <w:t xml:space="preserve">3.1　1990年代の海外出国者数の動向</w:t>
       </w:r>
     </w:p>
@@ -2806,6 +2824,10 @@
     <w:p/>
     <w:p>
       <w:r>
+        <w:rPr>
+          <w:b/>
+          <w:bCs/>
+        </w:rPr>
         <w:t xml:space="preserve">3.2　海外出国者が増加する背景と理由</w:t>
       </w:r>
     </w:p>
@@ -2874,6 +2896,8 @@
         <w:rPr>
           <w:rStyle w:val="normaltextrun"/>
           <w:rFonts w:ascii="Yu Mincho" w:hAnsi="Yu Mincho" w:eastAsia="Yu Mincho"/>
+          <w:b/>
+          <w:bCs/>
           <w:sz w:val="21"/>
           <w:szCs w:val="21"/>
         </w:rPr>
@@ -4387,6 +4411,8 @@
         <w:rPr>
           <w:rStyle w:val="eop"/>
           <w:rFonts w:ascii="Yu Mincho" w:hAnsi="Yu Mincho" w:eastAsia="Yu Mincho"/>
+          <w:b/>
+          <w:bCs/>
           <w:sz w:val="21"/>
           <w:szCs w:val="21"/>
         </w:rPr>
@@ -5859,6 +5885,8 @@
         <w:rPr>
           <w:rStyle w:val="eop"/>
           <w:rFonts w:ascii="Yu Mincho" w:hAnsi="Yu Mincho" w:eastAsia="Yu Mincho"/>
+          <w:b/>
+          <w:bCs/>
           <w:sz w:val="21"/>
           <w:szCs w:val="21"/>
         </w:rPr>
@@ -6916,6 +6944,8 @@
       <w:r>
         <w:rPr>
           <w:rFonts w:ascii="Yu Mincho" w:hAnsi="Yu Mincho" w:eastAsia="Yu Mincho" w:cs="Yu Mincho"/>
+          <w:b/>
+          <w:bCs/>
           <w:sz w:val="21"/>
           <w:szCs w:val="21"/>
         </w:rPr>
@@ -6959,6 +6989,8 @@
       <w:r>
         <w:rPr>
           <w:rFonts w:ascii="Yu Mincho" w:hAnsi="Yu Mincho" w:eastAsia="Yu Mincho" w:cs="Yu Mincho"/>
+          <w:b/>
+          <w:bCs/>
           <w:sz w:val="21"/>
           <w:szCs w:val="21"/>
         </w:rPr>
@@ -7945,6 +7977,8 @@
       <w:r>
         <w:rPr>
           <w:rFonts w:ascii="Yu Mincho" w:hAnsi="Yu Mincho" w:eastAsia="Yu Mincho" w:cs="Yu Mincho"/>
+          <w:b/>
+          <w:bCs/>
           <w:sz w:val="21"/>
           <w:szCs w:val="21"/>
         </w:rPr>
@@ -8931,6 +8965,8 @@
       <w:r>
         <w:rPr>
           <w:rFonts w:ascii="Yu Mincho" w:hAnsi="Yu Mincho" w:eastAsia="Yu Mincho" w:cs="Yu Mincho"/>
+          <w:b/>
+          <w:bCs/>
           <w:sz w:val="21"/>
           <w:szCs w:val="21"/>
         </w:rPr>
@@ -9918,6 +9954,8 @@
         <w:rPr>
           <w:rStyle w:val="normaltextrun"/>
           <w:rFonts w:ascii="Yu Mincho" w:hAnsi="Yu Mincho" w:eastAsia="Yu Mincho"/>
+          <w:b/>
+          <w:bCs/>
           <w:sz w:val="21"/>
           <w:szCs w:val="21"/>
         </w:rPr>
@@ -10197,6 +10235,10 @@
     <w:p/>
     <w:p>
       <w:r>
+        <w:rPr>
+          <w:b/>
+          <w:bCs/>
+        </w:rPr>
         <w:t xml:space="preserve">4章　データ分析</w:t>
       </w:r>
     </w:p>
@@ -10225,6 +10267,10 @@
     <w:p/>
     <w:p>
       <w:r>
+        <w:rPr>
+          <w:b/>
+          <w:bCs/>
+        </w:rPr>
         <w:t xml:space="preserve">4.1　相関係数</w:t>
       </w:r>
     </w:p>
@@ -11683,6 +11729,10 @@
     <w:p/>
     <w:p>
       <w:r>
+        <w:rPr>
+          <w:b/>
+          <w:bCs/>
+        </w:rPr>
         <w:t xml:space="preserve">4.2　相関図</w:t>
       </w:r>
     </w:p>
@@ -11723,6 +11773,8 @@
       <w:r>
         <w:rPr>
           <w:rFonts w:ascii="Yu Mincho" w:hAnsi="Yu Mincho" w:eastAsia="Yu Mincho" w:cs="Yu Mincho"/>
+          <w:b/>
+          <w:bCs/>
           <w:sz w:val="21"/>
           <w:szCs w:val="21"/>
         </w:rPr>
@@ -12327,6 +12379,8 @@
       <w:r>
         <w:rPr>
           <w:rFonts w:ascii="Yu Mincho" w:hAnsi="Yu Mincho" w:eastAsia="Yu Mincho" w:cs="Yu Mincho"/>
+          <w:b/>
+          <w:bCs/>
           <w:sz w:val="21"/>
           <w:szCs w:val="21"/>
         </w:rPr>
@@ -12942,6 +12996,8 @@
       <w:r>
         <w:rPr>
           <w:rFonts w:ascii="Yu Mincho" w:hAnsi="Yu Mincho" w:eastAsia="Yu Mincho" w:cs="Yu Mincho"/>
+          <w:b/>
+          <w:bCs/>
           <w:sz w:val="21"/>
           <w:szCs w:val="21"/>
         </w:rPr>
@@ -13583,6 +13639,8 @@
       <w:r>
         <w:rPr>
           <w:rFonts w:ascii="Yu Mincho" w:hAnsi="Yu Mincho" w:eastAsia="Yu Mincho" w:cs="Yu Mincho"/>
+          <w:b/>
+          <w:bCs/>
           <w:sz w:val="21"/>
           <w:szCs w:val="21"/>
         </w:rPr>
@@ -14078,6 +14136,8 @@
       <w:r>
         <w:rPr>
           <w:rFonts w:ascii="Yu Mincho" w:hAnsi="Yu Mincho" w:eastAsia="Yu Mincho" w:cs="Yu Mincho"/>
+          <w:b/>
+          <w:bCs/>
           <w:sz w:val="21"/>
           <w:szCs w:val="21"/>
         </w:rPr>
@@ -14563,6 +14623,8 @@
       <w:r>
         <w:rPr>
           <w:rFonts w:ascii="Yu Mincho" w:hAnsi="Yu Mincho" w:eastAsia="Yu Mincho" w:cs="Yu Mincho"/>
+          <w:b/>
+          <w:bCs/>
           <w:sz w:val="21"/>
           <w:szCs w:val="21"/>
         </w:rPr>
@@ -15160,6 +15222,10 @@
     <w:p/>
     <w:p>
       <w:r>
+        <w:rPr>
+          <w:b/>
+          <w:bCs/>
+        </w:rPr>
         <w:t xml:space="preserve">4.3　データ分析のまとめ</w:t>
       </w:r>
     </w:p>
@@ -15281,6 +15347,8 @@
       <w:r>
         <w:rPr>
           <w:rFonts w:ascii="Yu Mincho" w:hAnsi="Yu Mincho" w:eastAsia="Yu Mincho" w:cs="Yu Mincho"/>
+          <w:b/>
+          <w:bCs/>
           <w:sz w:val="21"/>
           <w:szCs w:val="21"/>
         </w:rPr>
@@ -16766,6 +16834,8 @@
         <w:rPr>
           <w:rStyle w:val="eop"/>
           <w:rFonts w:ascii="Yu Mincho" w:hAnsi="Yu Mincho" w:eastAsia="Yu Mincho"/>
+          <w:b/>
+          <w:bCs/>
           <w:sz w:val="21"/>
           <w:szCs w:val="21"/>
         </w:rPr>
@@ -16917,7 +16987,10 @@
     <w:p>
       <w:pPr/>
       <w:r>
-        <w:rPr/>
+        <w:rPr>
+          <w:b/>
+          <w:bCs/>
+        </w:rPr>
         <w:t>参考文献</w:t>
       </w:r>
     </w:p>
@@ -17021,7 +17094,10 @@
     <w:p>
       <w:pPr/>
       <w:r>
-        <w:rPr/>
+        <w:rPr>
+          <w:b/>
+          <w:bCs/>
+        </w:rPr>
         <w:t xml:space="preserve">Appendix. データ出典</w:t>
       </w:r>
     </w:p>
@@ -17965,7 +18041,10 @@
     <w:p>
       <w:pPr/>
       <w:r>
-        <w:rPr/>
+        <w:rPr>
+          <w:b/>
+          <w:bCs/>
+        </w:rPr>
         <w:t xml:space="preserve">役割分担</w:t>
       </w:r>
     </w:p>

</xml_diff>

<commit_message>
Enlarge chapter headings to 12pt in the revised Word thesis
Chapters 1-6 headings go from the body size (10.5pt) to 12pt; section
and sub-headings stay bold at the body size.

Co-Authored-By: Claude Opus 5.5 <noreply@anthropic.com>
Claude-Session: https://claude.ai/code/session_01FFSCEfHqq6dTPt6SnQgTAK
</commit_message>
<xml_diff>
--- a/thesis/卒業論文_修正反映版.docx
+++ b/thesis/卒業論文_修正反映版.docx
@@ -392,6 +392,8 @@
         <w:rPr>
           <w:b/>
           <w:bCs/>
+          <w:sz w:val="24"/>
+          <w:szCs w:val="24"/>
         </w:rPr>
         <w:t xml:space="preserve">1章　はじめに</w:t>
       </w:r>
@@ -476,7 +478,8 @@
           <w:b/>
           <w:bCs/>
           <w:color w:val="1F1F1F"/>
-          <w:szCs w:val="21"/>
+          <w:sz w:val="24"/>
+          <w:szCs w:val="24"/>
         </w:rPr>
         <w:t>2章　先行研究</w:t>
       </w:r>
@@ -2745,6 +2748,8 @@
         <w:rPr>
           <w:b/>
           <w:bCs/>
+          <w:sz w:val="24"/>
+          <w:szCs w:val="24"/>
         </w:rPr>
         <w:t xml:space="preserve">3章　現状分析</w:t>
       </w:r>
@@ -10238,6 +10243,8 @@
         <w:rPr>
           <w:b/>
           <w:bCs/>
+          <w:sz w:val="24"/>
+          <w:szCs w:val="24"/>
         </w:rPr>
         <w:t xml:space="preserve">4章　データ分析</w:t>
       </w:r>
@@ -15349,8 +15356,8 @@
           <w:rFonts w:ascii="Yu Mincho" w:hAnsi="Yu Mincho" w:eastAsia="Yu Mincho" w:cs="Yu Mincho"/>
           <w:b/>
           <w:bCs/>
-          <w:sz w:val="21"/>
-          <w:szCs w:val="21"/>
+          <w:sz w:val="24"/>
+          <w:szCs w:val="24"/>
         </w:rPr>
         <w:t xml:space="preserve">5章　回帰分析</w:t>
       </w:r>
@@ -16836,8 +16843,8 @@
           <w:rFonts w:ascii="Yu Mincho" w:hAnsi="Yu Mincho" w:eastAsia="Yu Mincho"/>
           <w:b/>
           <w:bCs/>
-          <w:sz w:val="21"/>
-          <w:szCs w:val="21"/>
+          <w:sz w:val="24"/>
+          <w:szCs w:val="24"/>
         </w:rPr>
         <w:t xml:space="preserve">6章　結論</w:t>
       </w:r>

</xml_diff>

<commit_message>
Add R-squared and number of observations to the regression table (checklist No.22)
Values from the Excel sheet 回帰分析② (the one whose coefficients match
the table): R2 = 0.942 (adjusted 0.927), n = 30. Added as two rows at
the bottom of the table in the Word file (表8) and in thesis.md (表9),
with a sentence interpreting R2. Change list and text export updated.

Refs #18

Co-Authored-By: Claude Opus 5.5 <noreply@anthropic.com>
Claude-Session: https://claude.ai/code/session_01FFSCEfHqq6dTPt6SnQgTAK
</commit_message>
<xml_diff>
--- a/thesis/卒業論文_修正反映版.docx
+++ b/thesis/卒業論文_修正反映版.docx
@@ -14864,6 +14864,310 @@
             <w:tcBorders>
               <w:top w:val="nil"/>
               <w:left w:val="nil"/>
+              <w:bottom w:val="single" w:color="auto" w:sz="4" w:space="0"/>
+              <w:right w:val="nil"/>
+            </w:tcBorders>
+            <w:tcMar>
+              <w:top w:w="15" w:type="dxa"/>
+              <w:left w:w="15" w:type="dxa"/>
+              <w:right w:w="15" w:type="dxa"/>
+            </w:tcMar>
+            <w:vAlign w:val="center"/>
+          </w:tcPr>
+          <w:p>
+            <w:r>
+              <w:rPr>
+                <w:rFonts w:ascii="Yu Gothic" w:hAnsi="Yu Gothic" w:eastAsia="Yu Gothic" w:cs="Yu Gothic"/>
+                <w:color w:val="000000" w:themeColor="text1"/>
+                <w:sz w:val="22"/>
+              </w:rPr>
+              <w:t>輸出額(10億USドル）</w:t>
+            </w:r>
+          </w:p>
+        </w:tc>
+        <w:tc>
+          <w:tcPr>
+            <w:tcW w:w="1058" w:type="dxa"/>
+            <w:tcBorders>
+              <w:top w:val="nil"/>
+              <w:left w:val="nil"/>
+              <w:bottom w:val="single" w:color="auto" w:sz="4" w:space="0"/>
+              <w:right w:val="nil"/>
+            </w:tcBorders>
+            <w:tcMar>
+              <w:top w:w="15" w:type="dxa"/>
+              <w:left w:w="15" w:type="dxa"/>
+              <w:right w:w="15" w:type="dxa"/>
+            </w:tcMar>
+            <w:vAlign w:val="center"/>
+          </w:tcPr>
+          <w:p>
+            <w:pPr>
+              <w:jc w:val="right"/>
+            </w:pPr>
+            <w:r>
+              <w:rPr>
+                <w:rFonts w:ascii="Yu Gothic" w:hAnsi="Yu Gothic" w:eastAsia="Yu Gothic" w:cs="Yu Gothic"/>
+                <w:color w:val="000000" w:themeColor="text1"/>
+                <w:sz w:val="22"/>
+              </w:rPr>
+              <w:t xml:space="preserve">1,929 </w:t>
+            </w:r>
+          </w:p>
+        </w:tc>
+        <w:tc>
+          <w:tcPr>
+            <w:tcW w:w="1060" w:type="dxa"/>
+            <w:tcBorders>
+              <w:top w:val="nil"/>
+              <w:left w:val="nil"/>
+              <w:bottom w:val="single" w:color="auto" w:sz="4" w:space="0"/>
+              <w:right w:val="nil"/>
+            </w:tcBorders>
+            <w:tcMar>
+              <w:top w:w="15" w:type="dxa"/>
+              <w:left w:w="15" w:type="dxa"/>
+              <w:right w:w="15" w:type="dxa"/>
+            </w:tcMar>
+            <w:vAlign w:val="center"/>
+          </w:tcPr>
+          <w:p>
+            <w:pPr>
+              <w:jc w:val="right"/>
+            </w:pPr>
+            <w:r>
+              <w:rPr>
+                <w:rFonts w:ascii="Yu Gothic" w:hAnsi="Yu Gothic" w:eastAsia="Yu Gothic" w:cs="Yu Gothic"/>
+                <w:color w:val="000000" w:themeColor="text1"/>
+                <w:sz w:val="22"/>
+              </w:rPr>
+              <w:t xml:space="preserve">5,648 </w:t>
+            </w:r>
+          </w:p>
+        </w:tc>
+        <w:tc>
+          <w:tcPr>
+            <w:tcW w:w="1061" w:type="dxa"/>
+            <w:tcBorders>
+              <w:top w:val="nil"/>
+              <w:left w:val="nil"/>
+              <w:bottom w:val="single" w:color="auto" w:sz="4" w:space="0"/>
+              <w:right w:val="nil"/>
+            </w:tcBorders>
+            <w:tcMar>
+              <w:top w:w="15" w:type="dxa"/>
+              <w:left w:w="15" w:type="dxa"/>
+              <w:right w:w="15" w:type="dxa"/>
+            </w:tcMar>
+            <w:vAlign w:val="center"/>
+          </w:tcPr>
+          <w:p>
+            <w:pPr>
+              <w:jc w:val="right"/>
+            </w:pPr>
+            <w:r>
+              <w:rPr>
+                <w:rFonts w:ascii="Yu Gothic" w:hAnsi="Yu Gothic" w:eastAsia="Yu Gothic" w:cs="Yu Gothic"/>
+                <w:color w:val="000000" w:themeColor="text1"/>
+                <w:sz w:val="22"/>
+              </w:rPr>
+              <w:t xml:space="preserve">0.341 </w:t>
+            </w:r>
+          </w:p>
+        </w:tc>
+        <w:tc>
+          <w:tcPr>
+            <w:tcW w:w="1052" w:type="dxa"/>
+            <w:tcBorders>
+              <w:top w:val="nil"/>
+              <w:left w:val="nil"/>
+              <w:bottom w:val="single" w:color="auto" w:sz="4" w:space="0"/>
+              <w:right w:val="nil"/>
+            </w:tcBorders>
+            <w:tcMar>
+              <w:top w:w="15" w:type="dxa"/>
+              <w:left w:w="15" w:type="dxa"/>
+              <w:right w:w="15" w:type="dxa"/>
+            </w:tcMar>
+            <w:vAlign w:val="center"/>
+          </w:tcPr>
+          <w:p>
+            <w:pPr>
+              <w:jc w:val="right"/>
+            </w:pPr>
+            <w:r>
+              <w:rPr>
+                <w:rFonts w:ascii="Yu Gothic" w:hAnsi="Yu Gothic" w:eastAsia="Yu Gothic" w:cs="Yu Gothic"/>
+                <w:color w:val="000000" w:themeColor="text1"/>
+                <w:sz w:val="22"/>
+              </w:rPr>
+              <w:t>0.736</w:t>
+            </w:r>
+          </w:p>
+        </w:tc>
+      </w:tr>
+      <w:tr>
+        <w:trPr>
+          <w:trHeight w:val="375"/>
+        </w:trPr>
+        <w:tc>
+          <w:tcPr>
+            <w:tcW w:w="2880" w:type="dxa"/>
+            <w:tcBorders>
+              <w:top w:val="nil"/>
+              <w:left w:val="nil"/>
+              <w:bottom w:val="nil"/>
+              <w:right w:val="nil"/>
+            </w:tcBorders>
+            <w:tcMar>
+              <w:top w:w="15" w:type="dxa"/>
+              <w:left w:w="15" w:type="dxa"/>
+              <w:right w:w="15" w:type="dxa"/>
+            </w:tcMar>
+            <w:vAlign w:val="center"/>
+          </w:tcPr>
+          <w:p>
+            <w:r>
+              <w:rPr>
+                <w:rFonts w:ascii="Yu Gothic" w:hAnsi="Yu Gothic" w:eastAsia="Yu Gothic" w:cs="Yu Gothic"/>
+                <w:color w:val="000000" w:themeColor="text1"/>
+                <w:sz w:val="22"/>
+              </w:rPr>
+              <w:t xml:space="preserve">決定係数</w:t>
+            </w:r>
+          </w:p>
+        </w:tc>
+        <w:tc>
+          <w:tcPr>
+            <w:tcW w:w="1058" w:type="dxa"/>
+            <w:tcBorders>
+              <w:top w:val="nil"/>
+              <w:left w:val="nil"/>
+              <w:bottom w:val="nil"/>
+              <w:right w:val="nil"/>
+            </w:tcBorders>
+            <w:tcMar>
+              <w:top w:w="15" w:type="dxa"/>
+              <w:left w:w="15" w:type="dxa"/>
+              <w:right w:w="15" w:type="dxa"/>
+            </w:tcMar>
+            <w:vAlign w:val="center"/>
+          </w:tcPr>
+          <w:p>
+            <w:pPr>
+              <w:jc w:val="right"/>
+            </w:pPr>
+            <w:r>
+              <w:rPr>
+                <w:rFonts w:ascii="Yu Gothic" w:hAnsi="Yu Gothic" w:eastAsia="Yu Gothic" w:cs="Yu Gothic"/>
+                <w:color w:val="000000" w:themeColor="text1"/>
+                <w:sz w:val="22"/>
+              </w:rPr>
+              <w:t xml:space="preserve">0.942</w:t>
+            </w:r>
+          </w:p>
+        </w:tc>
+        <w:tc>
+          <w:tcPr>
+            <w:tcW w:w="1060" w:type="dxa"/>
+            <w:tcBorders>
+              <w:top w:val="nil"/>
+              <w:left w:val="nil"/>
+              <w:bottom w:val="nil"/>
+              <w:right w:val="nil"/>
+            </w:tcBorders>
+            <w:tcMar>
+              <w:top w:w="15" w:type="dxa"/>
+              <w:left w:w="15" w:type="dxa"/>
+              <w:right w:w="15" w:type="dxa"/>
+            </w:tcMar>
+            <w:vAlign w:val="center"/>
+          </w:tcPr>
+          <w:p>
+            <w:pPr>
+              <w:jc w:val="right"/>
+            </w:pPr>
+            <w:r>
+              <w:rPr>
+                <w:rFonts w:ascii="Yu Gothic" w:hAnsi="Yu Gothic" w:eastAsia="Yu Gothic" w:cs="Yu Gothic"/>
+                <w:color w:val="000000" w:themeColor="text1"/>
+                <w:sz w:val="22"/>
+              </w:rPr>
+              <w:t xml:space="preserve"/>
+            </w:r>
+          </w:p>
+        </w:tc>
+        <w:tc>
+          <w:tcPr>
+            <w:tcW w:w="1061" w:type="dxa"/>
+            <w:tcBorders>
+              <w:top w:val="nil"/>
+              <w:left w:val="nil"/>
+              <w:bottom w:val="nil"/>
+              <w:right w:val="nil"/>
+            </w:tcBorders>
+            <w:tcMar>
+              <w:top w:w="15" w:type="dxa"/>
+              <w:left w:w="15" w:type="dxa"/>
+              <w:right w:w="15" w:type="dxa"/>
+            </w:tcMar>
+            <w:vAlign w:val="center"/>
+          </w:tcPr>
+          <w:p>
+            <w:pPr>
+              <w:jc w:val="right"/>
+            </w:pPr>
+            <w:r>
+              <w:rPr>
+                <w:rFonts w:ascii="Yu Gothic" w:hAnsi="Yu Gothic" w:eastAsia="Yu Gothic" w:cs="Yu Gothic"/>
+                <w:color w:val="000000" w:themeColor="text1"/>
+                <w:sz w:val="22"/>
+              </w:rPr>
+              <w:t xml:space="preserve"/>
+            </w:r>
+          </w:p>
+        </w:tc>
+        <w:tc>
+          <w:tcPr>
+            <w:tcW w:w="1052" w:type="dxa"/>
+            <w:tcBorders>
+              <w:top w:val="nil"/>
+              <w:left w:val="nil"/>
+              <w:bottom w:val="nil"/>
+              <w:right w:val="nil"/>
+            </w:tcBorders>
+            <w:tcMar>
+              <w:top w:w="15" w:type="dxa"/>
+              <w:left w:w="15" w:type="dxa"/>
+              <w:right w:w="15" w:type="dxa"/>
+            </w:tcMar>
+            <w:vAlign w:val="center"/>
+          </w:tcPr>
+          <w:p>
+            <w:pPr>
+              <w:jc w:val="right"/>
+            </w:pPr>
+            <w:r>
+              <w:rPr>
+                <w:rFonts w:ascii="Yu Gothic" w:hAnsi="Yu Gothic" w:eastAsia="Yu Gothic" w:cs="Yu Gothic"/>
+                <w:color w:val="000000" w:themeColor="text1"/>
+                <w:sz w:val="22"/>
+              </w:rPr>
+              <w:t xml:space="preserve"/>
+            </w:r>
+          </w:p>
+        </w:tc>
+      </w:tr>
+      <w:tr>
+        <w:trPr>
+          <w:trHeight w:val="390"/>
+        </w:trPr>
+        <w:tc>
+          <w:tcPr>
+            <w:tcW w:w="2880" w:type="dxa"/>
+            <w:tcBorders>
+              <w:top w:val="nil"/>
+              <w:left w:val="nil"/>
               <w:bottom w:val="single" w:color="auto" w:sz="8" w:space="0"/>
               <w:right w:val="nil"/>
             </w:tcBorders>
@@ -14881,7 +15185,7 @@
                 <w:color w:val="000000" w:themeColor="text1"/>
                 <w:sz w:val="22"/>
               </w:rPr>
-              <w:t>輸出額(10億USドル）</w:t>
+              <w:t xml:space="preserve">観測数</w:t>
             </w:r>
           </w:p>
         </w:tc>
@@ -14911,7 +15215,7 @@
                 <w:color w:val="000000" w:themeColor="text1"/>
                 <w:sz w:val="22"/>
               </w:rPr>
-              <w:t xml:space="preserve">1,929 </w:t>
+              <w:t xml:space="preserve">30</w:t>
             </w:r>
           </w:p>
         </w:tc>
@@ -14941,7 +15245,7 @@
                 <w:color w:val="000000" w:themeColor="text1"/>
                 <w:sz w:val="22"/>
               </w:rPr>
-              <w:t xml:space="preserve">5,648 </w:t>
+              <w:t xml:space="preserve"/>
             </w:r>
           </w:p>
         </w:tc>
@@ -14971,7 +15275,7 @@
                 <w:color w:val="000000" w:themeColor="text1"/>
                 <w:sz w:val="22"/>
               </w:rPr>
-              <w:t xml:space="preserve">0.341 </w:t>
+              <w:t xml:space="preserve"/>
             </w:r>
           </w:p>
         </w:tc>
@@ -15001,7 +15305,7 @@
                 <w:color w:val="000000" w:themeColor="text1"/>
                 <w:sz w:val="22"/>
               </w:rPr>
-              <w:t>0.736</w:t>
+              <w:t xml:space="preserve"/>
             </w:r>
           </w:p>
         </w:tc>
@@ -15055,6 +15359,28 @@
           <w:szCs w:val="21"/>
         </w:rPr>
         <w:t xml:space="preserve">Ŷ ＝ 425,844 ＋ 85,879X₁ − 62X₂ − 23,471X₃ − 29X₄ ＋ 6,503X₅ ＋ 1,929X₆</w:t>
+      </w:r>
+    </w:p>
+    <w:p>
+      <w:pPr>
+        <w:pStyle w:val="paragraph"/>
+        <w:spacing w:beforeAutospacing="0" w:afterAutospacing="0"/>
+        <w:jc w:val="both"/>
+        <w:rPr>
+          <w:rStyle w:val="eop"/>
+          <w:rFonts w:ascii="Yu Mincho" w:hAnsi="Yu Mincho" w:eastAsia="Yu Mincho"/>
+          <w:sz w:val="21"/>
+          <w:szCs w:val="21"/>
+        </w:rPr>
+      </w:pPr>
+      <w:r>
+        <w:rPr>
+          <w:rStyle w:val="eop"/>
+          <w:rFonts w:ascii="Yu Mincho" w:hAnsi="Yu Mincho" w:eastAsia="Yu Mincho"/>
+          <w:sz w:val="21"/>
+          <w:szCs w:val="21"/>
+        </w:rPr>
+        <w:t xml:space="preserve">表8より、決定係数は0.942であり（自由度調整済み決定係数は0.927）、国別の日本人出国者数の変動の約94％が6つの説明変数によって説明されていることから、推定したモデルの説明力は高いといえる。観測数は30である。</w:t>
       </w:r>
     </w:p>
     <w:p>

</xml_diff>